<commit_message>
Update graduation timeline and internship availability
</commit_message>
<xml_diff>
--- a/src/assets/resumes/Hyunwoo_Park_Resume.docx
+++ b/src/assets/resumes/Hyunwoo_Park_Resume.docx
@@ -1,6 +1,6 @@
 
 <file path=word/document.xml><?xml version="1.0" encoding="utf-8"?>
-<w:document xmlns:wpc="http://schemas.microsoft.com/office/word/2010/wordprocessingCanvas" xmlns:cx="http://schemas.microsoft.com/office/drawing/2014/chartex" xmlns:cx1="http://schemas.microsoft.com/office/drawing/2015/9/8/chartex" xmlns:cx2="http://schemas.microsoft.com/office/drawing/2015/10/21/chartex" xmlns:cx3="http://schemas.microsoft.com/office/drawing/2016/5/9/chartex" xmlns:cx4="http://schemas.microsoft.com/office/drawing/2016/5/10/chartex" xmlns:cx5="http://schemas.microsoft.com/office/drawing/2016/5/11/chartex" xmlns:cx6="http://schemas.microsoft.com/office/drawing/2016/5/12/chartex" xmlns:cx7="http://schemas.microsoft.com/office/drawing/2016/5/13/chartex" xmlns:cx8="http://schemas.microsoft.com/office/drawing/2016/5/14/chartex" xmlns:mc="http://schemas.openxmlformats.org/markup-compatibility/2006" xmlns:aink="http://schemas.microsoft.com/office/drawing/2016/ink" xmlns:am3d="http://schemas.microsoft.com/office/drawing/2017/model3d" xmlns:o="urn:schemas-microsoft-com:office:office" xmlns:oel="http://schemas.microsoft.com/office/2019/extlst" xmlns:r="http://schemas.openxmlformats.org/officeDocument/2006/relationships" xmlns:m="http://schemas.openxmlformats.org/officeDocument/2006/math" xmlns:v="urn:schemas-microsoft-com:vml" xmlns:wp14="http://schemas.microsoft.com/office/word/2010/wordprocessingDrawing" xmlns:wp="http://schemas.openxmlformats.org/drawingml/2006/wordprocessingDrawing" xmlns:w10="urn:schemas-microsoft-com:office:word" xmlns:w="http://schemas.openxmlformats.org/wordprocessingml/2006/main" xmlns:w14="http://schemas.microsoft.com/office/word/2010/wordml" xmlns:w15="http://schemas.microsoft.com/office/word/2012/wordml" xmlns:w16cei="http://schemas.microsoft.com/office/word/2026/wordml/cei" xmlns:w16cex="http://schemas.microsoft.com/office/word/2018/wordml/cex" xmlns:w16cid="http://schemas.microsoft.com/office/word/2016/wordml/cid" xmlns:w16="http://schemas.microsoft.com/office/word/2018/wordml" xmlns:w16du="http://schemas.microsoft.com/office/word/2023/wordml/word16du" xmlns:w16sdtdh="http://schemas.microsoft.com/office/word/2020/wordml/sdtdatahash" xmlns:w16sdtfl="http://schemas.microsoft.com/office/word/2024/wordml/sdtformatlock" xmlns:w16se="http://schemas.microsoft.com/office/word/2015/wordml/symex" xmlns:wpg="http://schemas.microsoft.com/office/word/2010/wordprocessingGroup" xmlns:wpi="http://schemas.microsoft.com/office/word/2010/wordprocessingInk" xmlns:wne="http://schemas.microsoft.com/office/word/2006/wordml" xmlns:wps="http://schemas.microsoft.com/office/word/2010/wordprocessingShape" mc:Ignorable="w14 w15 w16se w16cid w16 w16cex w16sdtdh w16sdtfl w16du wp14">
+<w:document xmlns:wpc="http://schemas.microsoft.com/office/word/2010/wordprocessingCanvas" xmlns:cx="http://schemas.microsoft.com/office/drawing/2014/chartex" xmlns:cx1="http://schemas.microsoft.com/office/drawing/2015/9/8/chartex" xmlns:cx2="http://schemas.microsoft.com/office/drawing/2015/10/21/chartex" xmlns:cx3="http://schemas.microsoft.com/office/drawing/2016/5/9/chartex" xmlns:cx4="http://schemas.microsoft.com/office/drawing/2016/5/10/chartex" xmlns:cx5="http://schemas.microsoft.com/office/drawing/2016/5/11/chartex" xmlns:cx6="http://schemas.microsoft.com/office/drawing/2016/5/12/chartex" xmlns:cx7="http://schemas.microsoft.com/office/drawing/2016/5/13/chartex" xmlns:cx8="http://schemas.microsoft.com/office/drawing/2016/5/14/chartex" xmlns:mc="http://schemas.openxmlformats.org/markup-compatibility/2006" xmlns:aink="http://schemas.microsoft.com/office/drawing/2016/ink" xmlns:am3d="http://schemas.microsoft.com/office/drawing/2017/model3d" xmlns:o="urn:schemas-microsoft-com:office:office" xmlns:oel="http://schemas.microsoft.com/office/2019/extlst" xmlns:r="http://schemas.openxmlformats.org/officeDocument/2006/relationships" xmlns:m="http://schemas.openxmlformats.org/officeDocument/2006/math" xmlns:v="urn:schemas-microsoft-com:vml" xmlns:wp14="http://schemas.microsoft.com/office/word/2010/wordprocessingDrawing" xmlns:wp="http://schemas.openxmlformats.org/drawingml/2006/wordprocessingDrawing" xmlns:w10="urn:schemas-microsoft-com:office:word" xmlns:w="http://schemas.openxmlformats.org/wordprocessingml/2006/main" xmlns:w14="http://schemas.microsoft.com/office/word/2010/wordml" xmlns:w15="http://schemas.microsoft.com/office/word/2012/wordml" xmlns:w16cex="http://schemas.microsoft.com/office/word/2018/wordml/cex" xmlns:w16cid="http://schemas.microsoft.com/office/word/2016/wordml/cid" xmlns:w16="http://schemas.microsoft.com/office/word/2018/wordml" xmlns:w16du="http://schemas.microsoft.com/office/word/2023/wordml/word16du" xmlns:w16sdtdh="http://schemas.microsoft.com/office/word/2020/wordml/sdtdatahash" xmlns:w16sdtfl="http://schemas.microsoft.com/office/word/2024/wordml/sdtformatlock" xmlns:w16se="http://schemas.microsoft.com/office/word/2015/wordml/symex" xmlns:wpg="http://schemas.microsoft.com/office/word/2010/wordprocessingGroup" xmlns:wpi="http://schemas.microsoft.com/office/word/2010/wordprocessingInk" xmlns:wne="http://schemas.microsoft.com/office/word/2006/wordml" xmlns:wps="http://schemas.microsoft.com/office/word/2010/wordprocessingShape" mc:Ignorable="w14 w15 w16se w16cid w16 w16cex w16sdtdh w16sdtfl w16du wp14">
   <w:body>
     <w:p>
       <w:pPr>
@@ -73,7 +73,37 @@
         <w:rPr>
           <w:rFonts w:ascii="Arial" w:hAnsi="Arial" w:cs="Arial"/>
         </w:rPr>
-        <w:t>(929) 988-2653</w:t>
+        <w:t>(</w:t>
+      </w:r>
+      <w:r>
+        <w:rPr>
+          <w:rFonts w:ascii="Arial" w:hAnsi="Arial" w:cs="Arial" w:hint="eastAsia"/>
+        </w:rPr>
+        <w:t>XXX</w:t>
+      </w:r>
+      <w:r>
+        <w:rPr>
+          <w:rFonts w:ascii="Arial" w:hAnsi="Arial" w:cs="Arial"/>
+        </w:rPr>
+        <w:t xml:space="preserve">) </w:t>
+      </w:r>
+      <w:r>
+        <w:rPr>
+          <w:rFonts w:ascii="Arial" w:hAnsi="Arial" w:cs="Arial" w:hint="eastAsia"/>
+        </w:rPr>
+        <w:t>XXX</w:t>
+      </w:r>
+      <w:r>
+        <w:rPr>
+          <w:rFonts w:ascii="Arial" w:hAnsi="Arial" w:cs="Arial"/>
+        </w:rPr>
+        <w:t>-</w:t>
+      </w:r>
+      <w:r>
+        <w:rPr>
+          <w:rFonts w:ascii="Arial" w:hAnsi="Arial" w:cs="Arial" w:hint="eastAsia"/>
+        </w:rPr>
+        <w:t>XXXX</w:t>
       </w:r>
       <w:r>
         <w:rPr>
@@ -206,26 +236,342 @@
           <w:b/>
           <w:bCs/>
         </w:rPr>
-        <w:t>OBJECTIVE</w:t>
-      </w:r>
-    </w:p>
-    <w:p>
-      <w:pPr>
-        <w:tabs>
-          <w:tab w:val="right" w:pos="720"/>
-          <w:tab w:val="right" w:pos="9360"/>
-          <w:tab w:val="right" w:pos="31680"/>
-        </w:tabs>
-        <w:spacing w:after="0" w:line="276" w:lineRule="auto"/>
-        <w:rPr>
-          <w:rFonts w:ascii="Arial" w:hAnsi="Arial" w:cs="Arial"/>
-        </w:rPr>
-      </w:pPr>
-      <w:r>
-        <w:rPr>
-          <w:rFonts w:ascii="Arial" w:hAnsi="Arial" w:cs="Arial" w:hint="eastAsia"/>
-        </w:rPr>
-        <w:t>Seeking an entry-level software engineering role building interactive game, web, or AI-enabled products.</w:t>
+        <w:t>EDUCATION</w:t>
+      </w:r>
+    </w:p>
+    <w:p>
+      <w:pPr>
+        <w:tabs>
+          <w:tab w:val="right" w:pos="720"/>
+          <w:tab w:val="right" w:pos="10800"/>
+        </w:tabs>
+        <w:spacing w:after="0" w:line="276" w:lineRule="auto"/>
+        <w:jc w:val="right"/>
+        <w:rPr>
+          <w:rFonts w:ascii="Arial" w:hAnsi="Arial" w:cs="Arial"/>
+        </w:rPr>
+      </w:pPr>
+      <w:r>
+        <w:rPr>
+          <w:rFonts w:ascii="Arial" w:hAnsi="Arial" w:cs="Arial"/>
+          <w:b/>
+          <w:bCs/>
+        </w:rPr>
+        <w:t>Rochester Institute of Technology (RIT),</w:t>
+      </w:r>
+      <w:r>
+        <w:rPr>
+          <w:rFonts w:ascii="Arial" w:hAnsi="Arial" w:cs="Arial"/>
+        </w:rPr>
+        <w:t xml:space="preserve"> Rochester, NY</w:t>
+      </w:r>
+      <w:r>
+        <w:rPr>
+          <w:rFonts w:ascii="Arial" w:hAnsi="Arial" w:cs="Arial"/>
+        </w:rPr>
+        <w:tab/>
+      </w:r>
+      <w:r>
+        <w:rPr>
+          <w:rFonts w:ascii="Arial" w:hAnsi="Arial" w:cs="Arial"/>
+        </w:rPr>
+        <w:t xml:space="preserve">Aug. 2022 </w:t>
+      </w:r>
+      <w:r>
+        <w:rPr>
+          <w:rFonts w:ascii="Arial" w:hAnsi="Arial" w:cs="Arial" w:hint="eastAsia"/>
+        </w:rPr>
+        <w:t>-</w:t>
+      </w:r>
+      <w:r>
+        <w:rPr>
+          <w:rFonts w:ascii="Arial" w:hAnsi="Arial" w:cs="Arial"/>
+        </w:rPr>
+        <w:t xml:space="preserve"> Expected Fall 2026</w:t>
+      </w:r>
+    </w:p>
+    <w:p>
+      <w:pPr>
+        <w:tabs>
+          <w:tab w:val="right" w:pos="720"/>
+          <w:tab w:val="right" w:pos="10800"/>
+        </w:tabs>
+        <w:spacing w:after="0" w:line="276" w:lineRule="auto"/>
+        <w:rPr>
+          <w:rFonts w:ascii="Arial" w:hAnsi="Arial" w:cs="Arial"/>
+          <w:b/>
+          <w:bCs/>
+        </w:rPr>
+      </w:pPr>
+      <w:r>
+        <w:rPr>
+          <w:rFonts w:ascii="Arial" w:hAnsi="Arial" w:cs="Arial"/>
+          <w:i/>
+          <w:iCs/>
+        </w:rPr>
+        <w:t>Bachelor of Science, Game Design and Development</w:t>
+      </w:r>
+      <w:r>
+        <w:rPr>
+          <w:rFonts w:ascii="Arial" w:hAnsi="Arial" w:cs="Arial"/>
+          <w:i/>
+          <w:iCs/>
+        </w:rPr>
+        <w:tab/>
+      </w:r>
+      <w:r>
+        <w:rPr>
+          <w:rFonts w:ascii="Arial" w:hAnsi="Arial" w:cs="Arial"/>
+          <w:b/>
+          <w:bCs/>
+        </w:rPr>
+        <w:t>GPA: 3.</w:t>
+      </w:r>
+      <w:r>
+        <w:rPr>
+          <w:rFonts w:ascii="Arial" w:hAnsi="Arial" w:cs="Arial" w:hint="eastAsia"/>
+          <w:b/>
+          <w:bCs/>
+        </w:rPr>
+        <w:t>7</w:t>
+      </w:r>
+      <w:r>
+        <w:rPr>
+          <w:rFonts w:ascii="Arial" w:hAnsi="Arial" w:cs="Arial"/>
+          <w:b/>
+          <w:bCs/>
+        </w:rPr>
+        <w:t>0</w:t>
+      </w:r>
+    </w:p>
+    <w:p>
+      <w:pPr>
+        <w:tabs>
+          <w:tab w:val="right" w:pos="720"/>
+          <w:tab w:val="right" w:pos="9360"/>
+          <w:tab w:val="right" w:pos="31680"/>
+        </w:tabs>
+        <w:spacing w:after="0" w:line="276" w:lineRule="auto"/>
+        <w:rPr>
+          <w:rFonts w:ascii="Arial" w:hAnsi="Arial" w:cs="Arial"/>
+        </w:rPr>
+      </w:pPr>
+      <w:r>
+        <w:rPr>
+          <w:rFonts w:ascii="Arial" w:hAnsi="Arial" w:cs="Arial"/>
+        </w:rPr>
+        <w:t>Dean</w:t>
+      </w:r>
+      <w:r>
+        <w:rPr>
+          <w:rFonts w:ascii="Arial" w:hAnsi="Arial" w:cs="Arial"/>
+        </w:rPr>
+        <w:t>'</w:t>
+      </w:r>
+      <w:r>
+        <w:rPr>
+          <w:rFonts w:ascii="Arial" w:hAnsi="Arial" w:cs="Arial"/>
+        </w:rPr>
+        <w:t>s</w:t>
+      </w:r>
+      <w:r>
+        <w:rPr>
+          <w:rFonts w:ascii="Arial" w:hAnsi="Arial" w:cs="Arial"/>
+        </w:rPr>
+        <w:t xml:space="preserve"> List: Fall 2022, Spring 2023</w:t>
+      </w:r>
+      <w:r>
+        <w:rPr>
+          <w:rFonts w:ascii="Arial" w:hAnsi="Arial" w:cs="Arial" w:hint="eastAsia"/>
+        </w:rPr>
+        <w:t>, Fall 2023, Spring 2024, Fall 2024, Fall 2025</w:t>
+      </w:r>
+    </w:p>
+    <w:p>
+      <w:pPr>
+        <w:tabs>
+          <w:tab w:val="right" w:pos="720"/>
+          <w:tab w:val="right" w:pos="9360"/>
+          <w:tab w:val="right" w:pos="31680"/>
+        </w:tabs>
+        <w:spacing w:after="0" w:line="276" w:lineRule="auto"/>
+        <w:rPr>
+          <w:rFonts w:ascii="Arial" w:hAnsi="Arial" w:cs="Arial"/>
+        </w:rPr>
+      </w:pPr>
+      <w:r>
+        <w:rPr>
+          <w:rFonts w:ascii="Arial" w:hAnsi="Arial" w:cs="Arial"/>
+        </w:rPr>
+        <w:t>Relevant Coursework: Game Design &amp; Development II; Game Modification</w:t>
+      </w:r>
+    </w:p>
+    <w:p>
+      <w:pPr>
+        <w:tabs>
+          <w:tab w:val="right" w:pos="720"/>
+          <w:tab w:val="right" w:pos="9360"/>
+          <w:tab w:val="right" w:pos="31680"/>
+        </w:tabs>
+        <w:spacing w:after="0" w:line="276" w:lineRule="auto"/>
+        <w:rPr>
+          <w:rFonts w:ascii="Arial" w:hAnsi="Arial" w:cs="Arial"/>
+        </w:rPr>
+      </w:pPr>
+    </w:p>
+    <w:p>
+      <w:pPr>
+        <w:tabs>
+          <w:tab w:val="right" w:pos="720"/>
+          <w:tab w:val="right" w:pos="10800"/>
+        </w:tabs>
+        <w:spacing w:after="0" w:line="276" w:lineRule="auto"/>
+        <w:jc w:val="right"/>
+        <w:rPr>
+          <w:rFonts w:ascii="Arial" w:hAnsi="Arial" w:cs="Arial"/>
+        </w:rPr>
+      </w:pPr>
+      <w:r>
+        <w:rPr>
+          <w:rFonts w:ascii="Arial" w:hAnsi="Arial" w:cs="Arial"/>
+          <w:b/>
+          <w:bCs/>
+        </w:rPr>
+        <w:t xml:space="preserve">Queensborough Community College (QCC), </w:t>
+      </w:r>
+      <w:r>
+        <w:rPr>
+          <w:rFonts w:ascii="Arial" w:hAnsi="Arial" w:cs="Arial"/>
+        </w:rPr>
+        <w:t>Bayside, NY</w:t>
+      </w:r>
+      <w:r>
+        <w:rPr>
+          <w:rFonts w:ascii="Arial" w:hAnsi="Arial" w:cs="Arial"/>
+        </w:rPr>
+        <w:tab/>
+      </w:r>
+      <w:r>
+        <w:rPr>
+          <w:rFonts w:ascii="Arial" w:hAnsi="Arial" w:cs="Arial"/>
+        </w:rPr>
+        <w:t>August</w:t>
+      </w:r>
+      <w:r>
+        <w:rPr>
+          <w:rFonts w:ascii="Arial" w:hAnsi="Arial" w:cs="Arial"/>
+        </w:rPr>
+        <w:t xml:space="preserve"> 2021 </w:t>
+      </w:r>
+      <w:r>
+        <w:rPr>
+          <w:rFonts w:ascii="Arial" w:hAnsi="Arial" w:cs="Arial" w:hint="eastAsia"/>
+        </w:rPr>
+        <w:t>-</w:t>
+      </w:r>
+      <w:r>
+        <w:rPr>
+          <w:rFonts w:ascii="Arial" w:hAnsi="Arial" w:cs="Arial"/>
+        </w:rPr>
+        <w:t xml:space="preserve"> </w:t>
+      </w:r>
+      <w:r>
+        <w:rPr>
+          <w:rFonts w:ascii="Arial" w:hAnsi="Arial" w:cs="Arial"/>
+        </w:rPr>
+        <w:t>May</w:t>
+      </w:r>
+      <w:r>
+        <w:rPr>
+          <w:rFonts w:ascii="Arial" w:hAnsi="Arial" w:cs="Arial"/>
+        </w:rPr>
+        <w:t xml:space="preserve"> 2022</w:t>
+      </w:r>
+    </w:p>
+    <w:p>
+      <w:pPr>
+        <w:tabs>
+          <w:tab w:val="right" w:pos="720"/>
+          <w:tab w:val="right" w:pos="10800"/>
+        </w:tabs>
+        <w:spacing w:after="0" w:line="276" w:lineRule="auto"/>
+        <w:jc w:val="right"/>
+        <w:rPr>
+          <w:rFonts w:ascii="Arial" w:hAnsi="Arial" w:cs="Arial"/>
+          <w:b/>
+          <w:bCs/>
+        </w:rPr>
+      </w:pPr>
+      <w:r>
+        <w:rPr>
+          <w:rFonts w:ascii="Arial" w:hAnsi="Arial" w:cs="Arial"/>
+          <w:i/>
+          <w:iCs/>
+        </w:rPr>
+        <w:t>Computer Science</w:t>
+      </w:r>
+      <w:r>
+        <w:rPr>
+          <w:rFonts w:ascii="Arial" w:hAnsi="Arial" w:cs="Arial" w:hint="eastAsia"/>
+          <w:i/>
+          <w:iCs/>
+        </w:rPr>
+        <w:t xml:space="preserve"> Coursework</w:t>
+      </w:r>
+      <w:r>
+        <w:rPr>
+          <w:rFonts w:ascii="Arial" w:hAnsi="Arial" w:cs="Arial"/>
+          <w:i/>
+          <w:iCs/>
+        </w:rPr>
+        <w:tab/>
+      </w:r>
+      <w:r>
+        <w:rPr>
+          <w:rFonts w:ascii="Arial" w:hAnsi="Arial" w:cs="Arial"/>
+          <w:b/>
+          <w:bCs/>
+        </w:rPr>
+        <w:t>GPA: 3.9</w:t>
+      </w:r>
+      <w:r>
+        <w:rPr>
+          <w:rFonts w:ascii="Arial" w:hAnsi="Arial" w:cs="Arial"/>
+          <w:b/>
+          <w:bCs/>
+        </w:rPr>
+        <w:t>5</w:t>
+      </w:r>
+    </w:p>
+    <w:p>
+      <w:pPr>
+        <w:tabs>
+          <w:tab w:val="right" w:pos="720"/>
+          <w:tab w:val="right" w:pos="9360"/>
+          <w:tab w:val="right" w:pos="31680"/>
+        </w:tabs>
+        <w:spacing w:after="0" w:line="276" w:lineRule="auto"/>
+        <w:rPr>
+          <w:rFonts w:ascii="Arial" w:hAnsi="Arial" w:cs="Arial"/>
+        </w:rPr>
+      </w:pPr>
+      <w:r>
+        <w:rPr>
+          <w:rFonts w:ascii="Arial" w:hAnsi="Arial" w:cs="Arial"/>
+        </w:rPr>
+        <w:t>Dean</w:t>
+      </w:r>
+      <w:r>
+        <w:rPr>
+          <w:rFonts w:ascii="Arial" w:hAnsi="Arial" w:cs="Arial"/>
+        </w:rPr>
+        <w:t>'</w:t>
+      </w:r>
+      <w:r>
+        <w:rPr>
+          <w:rFonts w:ascii="Arial" w:hAnsi="Arial" w:cs="Arial"/>
+        </w:rPr>
+        <w:t>s List: Fall 2021, Spring 2022</w:t>
       </w:r>
     </w:p>
     <w:p>
@@ -264,52 +610,46 @@
           <w:b/>
           <w:bCs/>
         </w:rPr>
-        <w:t>EDUCATION</w:t>
-      </w:r>
-    </w:p>
-    <w:p>
-      <w:pPr>
-        <w:tabs>
-          <w:tab w:val="right" w:pos="720"/>
-          <w:tab w:val="right" w:pos="10800"/>
-        </w:tabs>
-        <w:spacing w:after="0" w:line="276" w:lineRule="auto"/>
-        <w:jc w:val="right"/>
-        <w:rPr>
-          <w:rFonts w:ascii="Arial" w:hAnsi="Arial" w:cs="Arial"/>
-        </w:rPr>
-      </w:pPr>
-      <w:r>
-        <w:rPr>
-          <w:rFonts w:ascii="Arial" w:hAnsi="Arial" w:cs="Arial"/>
-          <w:b/>
-          <w:bCs/>
-        </w:rPr>
-        <w:t>Rochester Institute of Technology (RIT),</w:t>
-      </w:r>
-      <w:r>
-        <w:rPr>
-          <w:rFonts w:ascii="Arial" w:hAnsi="Arial" w:cs="Arial"/>
-        </w:rPr>
-        <w:t xml:space="preserve"> Rochester, NY</w:t>
-      </w:r>
-      <w:r>
-        <w:rPr>
-          <w:rFonts w:ascii="Arial" w:hAnsi="Arial" w:cs="Arial"/>
-        </w:rPr>
-        <w:tab/>
-      </w:r>
-      <w:r>
-        <w:rPr>
-          <w:rFonts w:ascii="Arial" w:hAnsi="Arial" w:cs="Arial"/>
-        </w:rPr>
-        <w:t>August 202</w:t>
-      </w:r>
-      <w:r>
-        <w:rPr>
-          <w:rFonts w:ascii="Arial" w:hAnsi="Arial" w:cs="Arial" w:hint="eastAsia"/>
-        </w:rPr>
-        <w:t>2</w:t>
+        <w:t>SKILLS</w:t>
+      </w:r>
+    </w:p>
+    <w:p>
+      <w:pPr>
+        <w:tabs>
+          <w:tab w:val="right" w:pos="720"/>
+          <w:tab w:val="right" w:pos="9360"/>
+          <w:tab w:val="right" w:pos="31680"/>
+        </w:tabs>
+        <w:spacing w:after="0" w:line="276" w:lineRule="auto"/>
+        <w:rPr>
+          <w:rFonts w:ascii="Arial" w:hAnsi="Arial" w:cs="Arial"/>
+        </w:rPr>
+      </w:pPr>
+      <w:r>
+        <w:rPr>
+          <w:rFonts w:ascii="Arial" w:hAnsi="Arial" w:cs="Arial" w:hint="eastAsia"/>
+          <w:b/>
+          <w:bCs/>
+        </w:rPr>
+        <w:t xml:space="preserve">Languages: </w:t>
+      </w:r>
+      <w:r>
+        <w:rPr>
+          <w:rFonts w:ascii="Arial" w:hAnsi="Arial" w:cs="Arial" w:hint="eastAsia"/>
+        </w:rPr>
+        <w:t xml:space="preserve">C#, C++, </w:t>
+      </w:r>
+      <w:r>
+        <w:rPr>
+          <w:rFonts w:ascii="Arial" w:hAnsi="Arial" w:cs="Arial"/>
+        </w:rPr>
+        <w:t>JavaScript</w:t>
+      </w:r>
+      <w:r>
+        <w:rPr>
+          <w:rFonts w:ascii="Arial" w:hAnsi="Arial" w:cs="Arial" w:hint="eastAsia"/>
+        </w:rPr>
+        <w:t>, HTML/CSS,</w:t>
       </w:r>
       <w:r>
         <w:rPr>
@@ -321,284 +661,88 @@
         <w:rPr>
           <w:rFonts w:ascii="Arial" w:hAnsi="Arial" w:cs="Arial" w:hint="eastAsia"/>
         </w:rPr>
-        <w:t>-</w:t>
-      </w:r>
-      <w:r>
-        <w:rPr>
-          <w:rFonts w:ascii="Arial" w:hAnsi="Arial" w:cs="Arial"/>
-        </w:rPr>
-        <w:t xml:space="preserve"> May 202</w:t>
-      </w:r>
-      <w:r>
-        <w:rPr>
-          <w:rFonts w:ascii="Arial" w:hAnsi="Arial" w:cs="Arial" w:hint="eastAsia"/>
-        </w:rPr>
-        <w:t>6</w:t>
-      </w:r>
-    </w:p>
-    <w:p>
-      <w:pPr>
-        <w:tabs>
-          <w:tab w:val="right" w:pos="720"/>
-          <w:tab w:val="right" w:pos="10800"/>
-        </w:tabs>
-        <w:spacing w:after="0" w:line="276" w:lineRule="auto"/>
-        <w:rPr>
-          <w:rFonts w:ascii="Arial" w:hAnsi="Arial" w:cs="Arial"/>
-          <w:b/>
-          <w:bCs/>
-        </w:rPr>
-      </w:pPr>
-      <w:r>
-        <w:rPr>
-          <w:rFonts w:ascii="Arial" w:hAnsi="Arial" w:cs="Arial"/>
-          <w:i/>
-          <w:iCs/>
-        </w:rPr>
-        <w:t>Bachelor of Science, Game Design and Development</w:t>
-      </w:r>
-      <w:r>
-        <w:rPr>
-          <w:rFonts w:ascii="Arial" w:hAnsi="Arial" w:cs="Arial"/>
-          <w:i/>
-          <w:iCs/>
-        </w:rPr>
-        <w:tab/>
-      </w:r>
-      <w:r>
-        <w:rPr>
-          <w:rFonts w:ascii="Arial" w:hAnsi="Arial" w:cs="Arial"/>
-          <w:b/>
-          <w:bCs/>
-        </w:rPr>
-        <w:t>GPA: 3.</w:t>
-      </w:r>
-      <w:r>
-        <w:rPr>
-          <w:rFonts w:ascii="Arial" w:hAnsi="Arial" w:cs="Arial" w:hint="eastAsia"/>
-          <w:b/>
-          <w:bCs/>
-        </w:rPr>
-        <w:t>7</w:t>
-      </w:r>
-      <w:r>
-        <w:rPr>
-          <w:rFonts w:ascii="Arial" w:hAnsi="Arial" w:cs="Arial"/>
-          <w:b/>
-          <w:bCs/>
-        </w:rPr>
-        <w:t>0</w:t>
-      </w:r>
-    </w:p>
-    <w:p>
-      <w:pPr>
-        <w:tabs>
-          <w:tab w:val="right" w:pos="720"/>
-          <w:tab w:val="right" w:pos="9360"/>
-          <w:tab w:val="right" w:pos="31680"/>
-        </w:tabs>
-        <w:spacing w:after="0" w:line="276" w:lineRule="auto"/>
-        <w:rPr>
-          <w:rFonts w:ascii="Arial" w:hAnsi="Arial" w:cs="Arial"/>
-        </w:rPr>
-      </w:pPr>
-      <w:r>
-        <w:rPr>
-          <w:rFonts w:ascii="Arial" w:hAnsi="Arial" w:cs="Arial"/>
-        </w:rPr>
-        <w:t>Dean</w:t>
-      </w:r>
-      <w:r>
-        <w:rPr>
-          <w:rFonts w:ascii="Arial" w:hAnsi="Arial" w:cs="Arial"/>
-        </w:rPr>
-        <w:t>'</w:t>
-      </w:r>
-      <w:r>
-        <w:rPr>
-          <w:rFonts w:ascii="Arial" w:hAnsi="Arial" w:cs="Arial"/>
-        </w:rPr>
-        <w:t>s</w:t>
-      </w:r>
-      <w:r>
-        <w:rPr>
-          <w:rFonts w:ascii="Arial" w:hAnsi="Arial" w:cs="Arial"/>
-        </w:rPr>
-        <w:t xml:space="preserve"> List: Fall 2022, Spring 2023</w:t>
-      </w:r>
-      <w:r>
-        <w:rPr>
-          <w:rFonts w:ascii="Arial" w:hAnsi="Arial" w:cs="Arial" w:hint="eastAsia"/>
-        </w:rPr>
-        <w:t>, Fall 2023, Spring 2024, Fall 2024, Fall 2025</w:t>
-      </w:r>
-    </w:p>
-    <w:p>
-      <w:pPr>
-        <w:tabs>
-          <w:tab w:val="right" w:pos="720"/>
-          <w:tab w:val="right" w:pos="9360"/>
-          <w:tab w:val="right" w:pos="31680"/>
-        </w:tabs>
-        <w:spacing w:after="0" w:line="276" w:lineRule="auto"/>
-        <w:rPr>
-          <w:rFonts w:ascii="Arial" w:hAnsi="Arial" w:cs="Arial"/>
-        </w:rPr>
-      </w:pPr>
-    </w:p>
-    <w:p>
-      <w:pPr>
-        <w:tabs>
-          <w:tab w:val="right" w:pos="720"/>
-          <w:tab w:val="right" w:pos="10800"/>
-        </w:tabs>
-        <w:spacing w:after="0" w:line="276" w:lineRule="auto"/>
-        <w:jc w:val="right"/>
-        <w:rPr>
-          <w:rFonts w:ascii="Arial" w:hAnsi="Arial" w:cs="Arial"/>
-        </w:rPr>
-      </w:pPr>
-      <w:r>
-        <w:rPr>
-          <w:rFonts w:ascii="Arial" w:hAnsi="Arial" w:cs="Arial"/>
-          <w:b/>
-          <w:bCs/>
-        </w:rPr>
-        <w:t xml:space="preserve">Queensborough Community College (QCC), </w:t>
-      </w:r>
-      <w:r>
-        <w:rPr>
-          <w:rFonts w:ascii="Arial" w:hAnsi="Arial" w:cs="Arial"/>
-        </w:rPr>
-        <w:t>Bayside, NY</w:t>
-      </w:r>
-      <w:r>
-        <w:rPr>
-          <w:rFonts w:ascii="Arial" w:hAnsi="Arial" w:cs="Arial"/>
-        </w:rPr>
-        <w:tab/>
-      </w:r>
-      <w:r>
-        <w:rPr>
-          <w:rFonts w:ascii="Arial" w:hAnsi="Arial" w:cs="Arial"/>
-        </w:rPr>
-        <w:t>August</w:t>
-      </w:r>
-      <w:r>
-        <w:rPr>
-          <w:rFonts w:ascii="Arial" w:hAnsi="Arial" w:cs="Arial"/>
-        </w:rPr>
-        <w:t xml:space="preserve"> 2021 </w:t>
-      </w:r>
-      <w:r>
-        <w:rPr>
-          <w:rFonts w:ascii="Arial" w:hAnsi="Arial" w:cs="Arial" w:hint="eastAsia"/>
-        </w:rPr>
-        <w:t>-</w:t>
-      </w:r>
-      <w:r>
-        <w:rPr>
-          <w:rFonts w:ascii="Arial" w:hAnsi="Arial" w:cs="Arial"/>
-        </w:rPr>
-        <w:t xml:space="preserve"> </w:t>
-      </w:r>
-      <w:r>
-        <w:rPr>
-          <w:rFonts w:ascii="Arial" w:hAnsi="Arial" w:cs="Arial"/>
-        </w:rPr>
-        <w:t>May</w:t>
-      </w:r>
-      <w:r>
-        <w:rPr>
-          <w:rFonts w:ascii="Arial" w:hAnsi="Arial" w:cs="Arial"/>
-        </w:rPr>
-        <w:t xml:space="preserve"> 2022</w:t>
-      </w:r>
-    </w:p>
-    <w:p>
-      <w:pPr>
-        <w:tabs>
-          <w:tab w:val="right" w:pos="720"/>
-          <w:tab w:val="right" w:pos="10800"/>
-        </w:tabs>
-        <w:spacing w:after="0" w:line="276" w:lineRule="auto"/>
-        <w:jc w:val="right"/>
-        <w:rPr>
-          <w:rFonts w:ascii="Arial" w:hAnsi="Arial" w:cs="Arial"/>
-          <w:b/>
-          <w:bCs/>
-        </w:rPr>
-      </w:pPr>
-      <w:r>
-        <w:rPr>
-          <w:rFonts w:ascii="Arial" w:hAnsi="Arial" w:cs="Arial"/>
-          <w:i/>
-          <w:iCs/>
-        </w:rPr>
-        <w:t>Computer Science</w:t>
-      </w:r>
-      <w:r>
-        <w:rPr>
-          <w:rFonts w:ascii="Arial" w:hAnsi="Arial" w:cs="Arial" w:hint="eastAsia"/>
-          <w:i/>
-          <w:iCs/>
-        </w:rPr>
-        <w:t xml:space="preserve"> Coursework</w:t>
-      </w:r>
-      <w:r>
-        <w:rPr>
-          <w:rFonts w:ascii="Arial" w:hAnsi="Arial" w:cs="Arial"/>
-          <w:i/>
-          <w:iCs/>
-        </w:rPr>
-        <w:tab/>
-      </w:r>
-      <w:r>
-        <w:rPr>
-          <w:rFonts w:ascii="Arial" w:hAnsi="Arial" w:cs="Arial"/>
-          <w:b/>
-          <w:bCs/>
-        </w:rPr>
-        <w:t>GPA: 3.9</w:t>
-      </w:r>
-      <w:r>
-        <w:rPr>
-          <w:rFonts w:ascii="Arial" w:hAnsi="Arial" w:cs="Arial"/>
-          <w:b/>
-          <w:bCs/>
-        </w:rPr>
-        <w:t>5</w:t>
-      </w:r>
-    </w:p>
-    <w:p>
-      <w:pPr>
-        <w:tabs>
-          <w:tab w:val="right" w:pos="720"/>
-          <w:tab w:val="right" w:pos="9360"/>
-          <w:tab w:val="right" w:pos="31680"/>
-        </w:tabs>
-        <w:spacing w:after="0" w:line="276" w:lineRule="auto"/>
-        <w:rPr>
-          <w:rFonts w:ascii="Arial" w:hAnsi="Arial" w:cs="Arial"/>
-        </w:rPr>
-      </w:pPr>
-      <w:r>
-        <w:rPr>
-          <w:rFonts w:ascii="Arial" w:hAnsi="Arial" w:cs="Arial"/>
-        </w:rPr>
-        <w:t>Dean</w:t>
-      </w:r>
-      <w:r>
-        <w:rPr>
-          <w:rFonts w:ascii="Arial" w:hAnsi="Arial" w:cs="Arial"/>
-        </w:rPr>
-        <w:t>'</w:t>
-      </w:r>
-      <w:r>
-        <w:rPr>
-          <w:rFonts w:ascii="Arial" w:hAnsi="Arial" w:cs="Arial"/>
-        </w:rPr>
-        <w:t>s List: Fall 2021, Spring 2022</w:t>
+        <w:t>HLSL</w:t>
+      </w:r>
+    </w:p>
+    <w:p>
+      <w:pPr>
+        <w:tabs>
+          <w:tab w:val="right" w:pos="720"/>
+          <w:tab w:val="right" w:pos="9360"/>
+          <w:tab w:val="right" w:pos="31680"/>
+        </w:tabs>
+        <w:spacing w:after="0" w:line="276" w:lineRule="auto"/>
+        <w:rPr>
+          <w:rFonts w:ascii="Arial" w:hAnsi="Arial" w:cs="Arial"/>
+        </w:rPr>
+      </w:pPr>
+      <w:r>
+        <w:rPr>
+          <w:rFonts w:ascii="Arial" w:hAnsi="Arial" w:cs="Arial" w:hint="eastAsia"/>
+          <w:b/>
+          <w:bCs/>
+        </w:rPr>
+        <w:t>Web:</w:t>
+      </w:r>
+      <w:r>
+        <w:rPr>
+          <w:rFonts w:ascii="Arial" w:hAnsi="Arial" w:cs="Arial" w:hint="eastAsia"/>
+        </w:rPr>
+        <w:t xml:space="preserve"> React, Vite, Tailwind CSS, Responsive UI, API Integration</w:t>
+      </w:r>
+    </w:p>
+    <w:p>
+      <w:pPr>
+        <w:tabs>
+          <w:tab w:val="right" w:pos="720"/>
+          <w:tab w:val="right" w:pos="9360"/>
+          <w:tab w:val="right" w:pos="31680"/>
+        </w:tabs>
+        <w:spacing w:after="0" w:line="276" w:lineRule="auto"/>
+        <w:rPr>
+          <w:rFonts w:ascii="Arial" w:hAnsi="Arial" w:cs="Arial"/>
+        </w:rPr>
+      </w:pPr>
+      <w:r>
+        <w:rPr>
+          <w:rFonts w:ascii="Arial" w:hAnsi="Arial" w:cs="Arial" w:hint="eastAsia"/>
+          <w:b/>
+          <w:bCs/>
+        </w:rPr>
+        <w:t>Game/Graphics:</w:t>
+      </w:r>
+      <w:r>
+        <w:rPr>
+          <w:rFonts w:ascii="Arial" w:hAnsi="Arial" w:cs="Arial" w:hint="eastAsia"/>
+        </w:rPr>
+        <w:t xml:space="preserve"> Unity, Direct3D11, Gameplay Programming, AI, State Machines, UI/UX</w:t>
+      </w:r>
+    </w:p>
+    <w:p>
+      <w:pPr>
+        <w:tabs>
+          <w:tab w:val="right" w:pos="720"/>
+          <w:tab w:val="right" w:pos="9360"/>
+          <w:tab w:val="right" w:pos="31680"/>
+        </w:tabs>
+        <w:spacing w:after="0" w:line="276" w:lineRule="auto"/>
+        <w:rPr>
+          <w:rFonts w:ascii="Arial" w:hAnsi="Arial" w:cs="Arial"/>
+        </w:rPr>
+      </w:pPr>
+      <w:r>
+        <w:rPr>
+          <w:rFonts w:ascii="Arial" w:hAnsi="Arial" w:cs="Arial" w:hint="eastAsia"/>
+          <w:b/>
+          <w:bCs/>
+        </w:rPr>
+        <w:t>Tools:</w:t>
+      </w:r>
+      <w:r>
+        <w:rPr>
+          <w:rFonts w:ascii="Arial" w:hAnsi="Arial" w:cs="Arial" w:hint="eastAsia"/>
+        </w:rPr>
+        <w:t xml:space="preserve"> Git, GitHub, Visual Studio, VS Code, Arduino</w:t>
       </w:r>
     </w:p>
     <w:p>
@@ -637,177 +781,6 @@
           <w:b/>
           <w:bCs/>
         </w:rPr>
-        <w:t>SKILLS</w:t>
-      </w:r>
-    </w:p>
-    <w:p>
-      <w:pPr>
-        <w:tabs>
-          <w:tab w:val="right" w:pos="720"/>
-          <w:tab w:val="right" w:pos="9360"/>
-          <w:tab w:val="right" w:pos="31680"/>
-        </w:tabs>
-        <w:spacing w:after="0" w:line="276" w:lineRule="auto"/>
-        <w:rPr>
-          <w:rFonts w:ascii="Arial" w:hAnsi="Arial" w:cs="Arial"/>
-        </w:rPr>
-      </w:pPr>
-      <w:r>
-        <w:rPr>
-          <w:rFonts w:ascii="Arial" w:hAnsi="Arial" w:cs="Arial" w:hint="eastAsia"/>
-          <w:b/>
-          <w:bCs/>
-        </w:rPr>
-        <w:t xml:space="preserve">Languages: </w:t>
-      </w:r>
-      <w:r>
-        <w:rPr>
-          <w:rFonts w:ascii="Arial" w:hAnsi="Arial" w:cs="Arial" w:hint="eastAsia"/>
-        </w:rPr>
-        <w:t xml:space="preserve">C#, C++, </w:t>
-      </w:r>
-      <w:r>
-        <w:rPr>
-          <w:rFonts w:ascii="Arial" w:hAnsi="Arial" w:cs="Arial"/>
-        </w:rPr>
-        <w:t>JavaScript</w:t>
-      </w:r>
-      <w:r>
-        <w:rPr>
-          <w:rFonts w:ascii="Arial" w:hAnsi="Arial" w:cs="Arial" w:hint="eastAsia"/>
-        </w:rPr>
-        <w:t>, HTML/CSS,</w:t>
-      </w:r>
-      <w:r>
-        <w:rPr>
-          <w:rFonts w:ascii="Arial" w:hAnsi="Arial" w:cs="Arial"/>
-        </w:rPr>
-        <w:t xml:space="preserve"> </w:t>
-      </w:r>
-      <w:r>
-        <w:rPr>
-          <w:rFonts w:ascii="Arial" w:hAnsi="Arial" w:cs="Arial" w:hint="eastAsia"/>
-        </w:rPr>
-        <w:t>HLSL</w:t>
-      </w:r>
-    </w:p>
-    <w:p>
-      <w:pPr>
-        <w:tabs>
-          <w:tab w:val="right" w:pos="720"/>
-          <w:tab w:val="right" w:pos="9360"/>
-          <w:tab w:val="right" w:pos="31680"/>
-        </w:tabs>
-        <w:spacing w:after="0" w:line="276" w:lineRule="auto"/>
-        <w:rPr>
-          <w:rFonts w:ascii="Arial" w:hAnsi="Arial" w:cs="Arial"/>
-        </w:rPr>
-      </w:pPr>
-      <w:r>
-        <w:rPr>
-          <w:rFonts w:ascii="Arial" w:hAnsi="Arial" w:cs="Arial" w:hint="eastAsia"/>
-          <w:b/>
-          <w:bCs/>
-        </w:rPr>
-        <w:t>Web:</w:t>
-      </w:r>
-      <w:r>
-        <w:rPr>
-          <w:rFonts w:ascii="Arial" w:hAnsi="Arial" w:cs="Arial" w:hint="eastAsia"/>
-        </w:rPr>
-        <w:t xml:space="preserve"> React, Vite, Tailwind CSS, Responsive UI, API Integration</w:t>
-      </w:r>
-    </w:p>
-    <w:p>
-      <w:pPr>
-        <w:tabs>
-          <w:tab w:val="right" w:pos="720"/>
-          <w:tab w:val="right" w:pos="9360"/>
-          <w:tab w:val="right" w:pos="31680"/>
-        </w:tabs>
-        <w:spacing w:after="0" w:line="276" w:lineRule="auto"/>
-        <w:rPr>
-          <w:rFonts w:ascii="Arial" w:hAnsi="Arial" w:cs="Arial"/>
-        </w:rPr>
-      </w:pPr>
-      <w:r>
-        <w:rPr>
-          <w:rFonts w:ascii="Arial" w:hAnsi="Arial" w:cs="Arial" w:hint="eastAsia"/>
-          <w:b/>
-          <w:bCs/>
-        </w:rPr>
-        <w:t>Game/Graphics:</w:t>
-      </w:r>
-      <w:r>
-        <w:rPr>
-          <w:rFonts w:ascii="Arial" w:hAnsi="Arial" w:cs="Arial" w:hint="eastAsia"/>
-        </w:rPr>
-        <w:t xml:space="preserve"> Unity, Direct3D11, Gameplay Programming, AI, State Machines, UI/UX</w:t>
-      </w:r>
-    </w:p>
-    <w:p>
-      <w:pPr>
-        <w:tabs>
-          <w:tab w:val="right" w:pos="720"/>
-          <w:tab w:val="right" w:pos="9360"/>
-          <w:tab w:val="right" w:pos="31680"/>
-        </w:tabs>
-        <w:spacing w:after="0" w:line="276" w:lineRule="auto"/>
-        <w:rPr>
-          <w:rFonts w:ascii="Arial" w:hAnsi="Arial" w:cs="Arial"/>
-        </w:rPr>
-      </w:pPr>
-      <w:r>
-        <w:rPr>
-          <w:rFonts w:ascii="Arial" w:hAnsi="Arial" w:cs="Arial" w:hint="eastAsia"/>
-          <w:b/>
-          <w:bCs/>
-        </w:rPr>
-        <w:t>Tools:</w:t>
-      </w:r>
-      <w:r>
-        <w:rPr>
-          <w:rFonts w:ascii="Arial" w:hAnsi="Arial" w:cs="Arial" w:hint="eastAsia"/>
-        </w:rPr>
-        <w:t xml:space="preserve"> Git, GitHub, Visual Studio, VS Code, Arduino</w:t>
-      </w:r>
-    </w:p>
-    <w:p>
-      <w:pPr>
-        <w:tabs>
-          <w:tab w:val="right" w:pos="720"/>
-          <w:tab w:val="right" w:pos="9360"/>
-          <w:tab w:val="right" w:pos="31680"/>
-        </w:tabs>
-        <w:spacing w:after="0" w:line="276" w:lineRule="auto"/>
-        <w:rPr>
-          <w:rFonts w:ascii="Arial" w:hAnsi="Arial" w:cs="Arial"/>
-        </w:rPr>
-      </w:pPr>
-    </w:p>
-    <w:p>
-      <w:pPr>
-        <w:pBdr>
-          <w:bottom w:val="single" w:sz="12" w:space="1" w:color="auto"/>
-        </w:pBdr>
-        <w:tabs>
-          <w:tab w:val="right" w:pos="720"/>
-          <w:tab w:val="right" w:pos="9360"/>
-          <w:tab w:val="right" w:pos="31680"/>
-        </w:tabs>
-        <w:spacing w:after="0" w:line="276" w:lineRule="auto"/>
-        <w:rPr>
-          <w:rFonts w:ascii="Arial" w:hAnsi="Arial" w:cs="Arial"/>
-          <w:b/>
-          <w:bCs/>
-        </w:rPr>
-      </w:pPr>
-      <w:r>
-        <w:rPr>
-          <w:rFonts w:ascii="Arial" w:hAnsi="Arial" w:cs="Arial"/>
-          <w:b/>
-          <w:bCs/>
-        </w:rPr>
         <w:t>PROJECT</w:t>
       </w:r>
     </w:p>
@@ -828,7 +801,7 @@
           <w:b/>
           <w:bCs/>
         </w:rPr>
-        <w:t>PokePilot - Competitive Pokemon Team Builder</w:t>
+        <w:t>PokePilot - AI-Assisted Pokemon Team Builder</w:t>
       </w:r>
       <w:r>
         <w:rPr>
@@ -866,7 +839,7 @@
         <w:rPr>
           <w:rFonts w:ascii="Arial" w:hAnsi="Arial" w:cs="Arial" w:hint="eastAsia"/>
         </w:rPr>
-        <w:t>Built and deployed a responsive React/TypeScript team builder and damage calculator.</w:t>
+        <w:t>Built and deployed a React/TypeScript Pokemon team-building app on Cloudflare Workers.</w:t>
       </w:r>
     </w:p>
     <w:p>
@@ -890,31 +863,7 @@
         <w:rPr>
           <w:rFonts w:ascii="Arial" w:hAnsi="Arial" w:cs="Arial" w:hint="eastAsia"/>
         </w:rPr>
-        <w:t>Unified Showdown and Smogon data for legality</w:t>
-      </w:r>
-      <w:r>
-        <w:rPr>
-          <w:rFonts w:ascii="Arial" w:hAnsi="Arial" w:cs="Arial" w:hint="eastAsia"/>
-        </w:rPr>
-        <w:t xml:space="preserve"> checks</w:t>
-      </w:r>
-      <w:r>
-        <w:rPr>
-          <w:rFonts w:ascii="Arial" w:hAnsi="Arial" w:cs="Arial" w:hint="eastAsia"/>
-        </w:rPr>
-        <w:t>, usage</w:t>
-      </w:r>
-      <w:r>
-        <w:rPr>
-          <w:rFonts w:ascii="Arial" w:hAnsi="Arial" w:cs="Arial" w:hint="eastAsia"/>
-        </w:rPr>
-        <w:t>-based</w:t>
-      </w:r>
-      <w:r>
-        <w:rPr>
-          <w:rFonts w:ascii="Arial" w:hAnsi="Arial" w:cs="Arial" w:hint="eastAsia"/>
-        </w:rPr>
-        <w:t xml:space="preserve"> defaults, and battle calculations.</w:t>
+        <w:t>Integrated Pokemon APIs and competitive-play datasets so users can explore available options, apply common configurations, and calculate battle outcomes.</w:t>
       </w:r>
     </w:p>
     <w:p>
@@ -938,19 +887,31 @@
         <w:rPr>
           <w:rFonts w:ascii="Arial" w:hAnsi="Arial" w:cs="Arial" w:hint="eastAsia"/>
         </w:rPr>
-        <w:t>Built OpenAI</w:t>
-      </w:r>
-      <w:r>
-        <w:rPr>
-          <w:rFonts w:ascii="Arial" w:hAnsi="Arial" w:cs="Arial" w:hint="eastAsia"/>
-        </w:rPr>
-        <w:t>-powered strategy</w:t>
-      </w:r>
-      <w:r>
-        <w:rPr>
-          <w:rFonts w:ascii="Arial" w:hAnsi="Arial" w:cs="Arial" w:hint="eastAsia"/>
-        </w:rPr>
-        <w:t xml:space="preserve"> analysis with schema validation, prompt caching, and Redis rate limits.</w:t>
+        <w:t>Added OpenAI-powered analysis to explain team weaknesses and suggest improvements.</w:t>
+      </w:r>
+    </w:p>
+    <w:p>
+      <w:pPr>
+        <w:pStyle w:val="ListParagraph"/>
+        <w:numPr>
+          <w:ilvl w:val="0"/>
+          <w:numId w:val="3"/>
+        </w:numPr>
+        <w:tabs>
+          <w:tab w:val="right" w:pos="720"/>
+          <w:tab w:val="right" w:pos="9360"/>
+          <w:tab w:val="right" w:pos="31680"/>
+        </w:tabs>
+        <w:spacing w:after="0" w:line="276" w:lineRule="auto"/>
+        <w:rPr>
+          <w:rFonts w:ascii="Arial" w:hAnsi="Arial" w:cs="Arial"/>
+        </w:rPr>
+      </w:pPr>
+      <w:r>
+        <w:rPr>
+          <w:rFonts w:ascii="Arial" w:hAnsi="Arial" w:cs="Arial" w:hint="eastAsia"/>
+        </w:rPr>
+        <w:t>Connected Google sign-in with Cloudflare D1 storage to synchronize saved teams and preferences across devices.</w:t>
       </w:r>
     </w:p>
     <w:p>
@@ -1008,7 +969,7 @@
         <w:rPr>
           <w:rFonts w:ascii="Arial" w:hAnsi="Arial" w:cs="Arial" w:hint="eastAsia"/>
         </w:rPr>
-        <w:t>Developed a Terraria mod in C# with tModLoader in a team of 5, creating custom enemies and bosses.</w:t>
+        <w:t>Developed custom enemies and bosses for a Terraria mod using C# as part of a five-person team.</w:t>
       </w:r>
     </w:p>
     <w:p>
@@ -1032,7 +993,7 @@
         <w:rPr>
           <w:rFonts w:ascii="Arial" w:hAnsi="Arial" w:cs="Arial" w:hint="eastAsia"/>
         </w:rPr>
-        <w:t>Designed state-machine-based AI for NPCs and bosses, including attack logic and animation control.</w:t>
+        <w:t>Implemented state-machine-based enemy behavior to coordinate attack sequences and animations.</w:t>
       </w:r>
     </w:p>
     <w:p>
@@ -1056,7 +1017,7 @@
         <w:rPr>
           <w:rFonts w:ascii="Arial" w:hAnsi="Arial" w:cs="Arial" w:hint="eastAsia"/>
         </w:rPr>
-        <w:t>Implemented gameplay features including projectiles, collision, and physics using the Terraria/XNA framework.</w:t>
+        <w:t>Integrated projectiles, collision handling, and physics with existing Terraria/XNA systems to support custom combat encounters.</w:t>
       </w:r>
     </w:p>
     <w:p>
@@ -1114,7 +1075,7 @@
         <w:rPr>
           <w:rFonts w:ascii="Arial" w:hAnsi="Arial" w:cs="Arial" w:hint="eastAsia"/>
         </w:rPr>
-        <w:t>Developed a top-down shooter in Unity using C# as part of a 5-person team.</w:t>
+        <w:t>Developed core gameplay and interfaces for a Unity/C# top-down shooter in a five-person team.</w:t>
       </w:r>
     </w:p>
     <w:p>
@@ -1138,7 +1099,7 @@
         <w:rPr>
           <w:rFonts w:ascii="Arial" w:hAnsi="Arial" w:cs="Arial" w:hint="eastAsia"/>
         </w:rPr>
-        <w:t>Implemented core gameplay systems, including game loop, character stats, and camera movement.</w:t>
+        <w:t>Implemented the game loop, character statistics, and camera movement to manage gameplay flow and player tracking.</w:t>
       </w:r>
     </w:p>
     <w:p>
@@ -1162,7 +1123,7 @@
         <w:rPr>
           <w:rFonts w:ascii="Arial" w:hAnsi="Arial" w:cs="Arial" w:hint="eastAsia"/>
         </w:rPr>
-        <w:t>Designed and implemented UI and HUD systems for gameplay and menus.</w:t>
+        <w:t>Built HUD elements to display player state and menu interfaces to help players navigate the game.</w:t>
       </w:r>
     </w:p>
     <w:p>
@@ -1343,7 +1304,7 @@
         <w:rPr>
           <w:rFonts w:ascii="Arial" w:hAnsi="Arial" w:cs="Arial" w:hint="eastAsia"/>
         </w:rPr>
-        <w:t>Prepared food and restocked supplies in a fast-paced dining environment.</w:t>
+        <w:t>Trained new employees and supported multiple dining stations, including shift coverage and event setup, to keep daily operations running smoothly.</w:t>
       </w:r>
     </w:p>
     <w:p>
@@ -1367,55 +1328,7 @@
         <w:rPr>
           <w:rFonts w:ascii="Arial" w:hAnsi="Arial" w:cs="Arial" w:hint="eastAsia"/>
         </w:rPr>
-        <w:t>Maintained cleanliness of dining areas and ensured food safety through temperature checks.</w:t>
-      </w:r>
-    </w:p>
-    <w:p>
-      <w:pPr>
-        <w:pStyle w:val="ListParagraph"/>
-        <w:numPr>
-          <w:ilvl w:val="0"/>
-          <w:numId w:val="3"/>
-        </w:numPr>
-        <w:tabs>
-          <w:tab w:val="right" w:pos="720"/>
-          <w:tab w:val="right" w:pos="9360"/>
-          <w:tab w:val="right" w:pos="31680"/>
-        </w:tabs>
-        <w:spacing w:after="0" w:line="276" w:lineRule="auto"/>
-        <w:rPr>
-          <w:rFonts w:ascii="Arial" w:hAnsi="Arial" w:cs="Arial"/>
-        </w:rPr>
-      </w:pPr>
-      <w:r>
-        <w:rPr>
-          <w:rFonts w:ascii="Arial" w:hAnsi="Arial" w:cs="Arial" w:hint="eastAsia"/>
-        </w:rPr>
-        <w:t>Trained new employees and assisted multiple stations to support daily operations.</w:t>
-      </w:r>
-    </w:p>
-    <w:p>
-      <w:pPr>
-        <w:pStyle w:val="ListParagraph"/>
-        <w:numPr>
-          <w:ilvl w:val="0"/>
-          <w:numId w:val="3"/>
-        </w:numPr>
-        <w:tabs>
-          <w:tab w:val="right" w:pos="720"/>
-          <w:tab w:val="right" w:pos="9360"/>
-          <w:tab w:val="right" w:pos="31680"/>
-        </w:tabs>
-        <w:spacing w:after="0" w:line="276" w:lineRule="auto"/>
-        <w:rPr>
-          <w:rFonts w:ascii="Arial" w:hAnsi="Arial" w:cs="Arial"/>
-        </w:rPr>
-      </w:pPr>
-      <w:r>
-        <w:rPr>
-          <w:rFonts w:ascii="Arial" w:hAnsi="Arial" w:cs="Arial" w:hint="eastAsia"/>
-        </w:rPr>
-        <w:t>Supported event setup, cleanup, and shift coverage when needed.</w:t>
+        <w:t>Prepared food, replenished supplies, and monitored food temperatures while maintaining clean work areas and following food-safety procedures.</w:t>
       </w:r>
     </w:p>
     <w:sectPr>
@@ -1430,7 +1343,7 @@
 </file>
 
 <file path=word/endnotes.xml><?xml version="1.0" encoding="utf-8"?>
-<w:endnotes xmlns:wpc="http://schemas.microsoft.com/office/word/2010/wordprocessingCanvas" xmlns:cx="http://schemas.microsoft.com/office/drawing/2014/chartex" xmlns:cx1="http://schemas.microsoft.com/office/drawing/2015/9/8/chartex" xmlns:cx2="http://schemas.microsoft.com/office/drawing/2015/10/21/chartex" xmlns:cx3="http://schemas.microsoft.com/office/drawing/2016/5/9/chartex" xmlns:cx4="http://schemas.microsoft.com/office/drawing/2016/5/10/chartex" xmlns:cx5="http://schemas.microsoft.com/office/drawing/2016/5/11/chartex" xmlns:cx6="http://schemas.microsoft.com/office/drawing/2016/5/12/chartex" xmlns:cx7="http://schemas.microsoft.com/office/drawing/2016/5/13/chartex" xmlns:cx8="http://schemas.microsoft.com/office/drawing/2016/5/14/chartex" xmlns:mc="http://schemas.openxmlformats.org/markup-compatibility/2006" xmlns:aink="http://schemas.microsoft.com/office/drawing/2016/ink" xmlns:am3d="http://schemas.microsoft.com/office/drawing/2017/model3d" xmlns:o="urn:schemas-microsoft-com:office:office" xmlns:oel="http://schemas.microsoft.com/office/2019/extlst" xmlns:r="http://schemas.openxmlformats.org/officeDocument/2006/relationships" xmlns:m="http://schemas.openxmlformats.org/officeDocument/2006/math" xmlns:v="urn:schemas-microsoft-com:vml" xmlns:wp14="http://schemas.microsoft.com/office/word/2010/wordprocessingDrawing" xmlns:wp="http://schemas.openxmlformats.org/drawingml/2006/wordprocessingDrawing" xmlns:w10="urn:schemas-microsoft-com:office:word" xmlns:w="http://schemas.openxmlformats.org/wordprocessingml/2006/main" xmlns:w14="http://schemas.microsoft.com/office/word/2010/wordml" xmlns:w15="http://schemas.microsoft.com/office/word/2012/wordml" xmlns:w16cei="http://schemas.microsoft.com/office/word/2026/wordml/cei" xmlns:w16cex="http://schemas.microsoft.com/office/word/2018/wordml/cex" xmlns:w16cid="http://schemas.microsoft.com/office/word/2016/wordml/cid" xmlns:w16="http://schemas.microsoft.com/office/word/2018/wordml" xmlns:w16du="http://schemas.microsoft.com/office/word/2023/wordml/word16du" xmlns:w16sdtdh="http://schemas.microsoft.com/office/word/2020/wordml/sdtdatahash" xmlns:w16sdtfl="http://schemas.microsoft.com/office/word/2024/wordml/sdtformatlock" xmlns:w16se="http://schemas.microsoft.com/office/word/2015/wordml/symex" xmlns:wpg="http://schemas.microsoft.com/office/word/2010/wordprocessingGroup" xmlns:wpi="http://schemas.microsoft.com/office/word/2010/wordprocessingInk" xmlns:wne="http://schemas.microsoft.com/office/word/2006/wordml" xmlns:wps="http://schemas.microsoft.com/office/word/2010/wordprocessingShape" mc:Ignorable="w14 w15 w16se w16cid w16 w16cex w16sdtdh w16sdtfl w16du wp14">
+<w:endnotes xmlns:wpc="http://schemas.microsoft.com/office/word/2010/wordprocessingCanvas" xmlns:cx="http://schemas.microsoft.com/office/drawing/2014/chartex" xmlns:cx1="http://schemas.microsoft.com/office/drawing/2015/9/8/chartex" xmlns:cx2="http://schemas.microsoft.com/office/drawing/2015/10/21/chartex" xmlns:cx3="http://schemas.microsoft.com/office/drawing/2016/5/9/chartex" xmlns:cx4="http://schemas.microsoft.com/office/drawing/2016/5/10/chartex" xmlns:cx5="http://schemas.microsoft.com/office/drawing/2016/5/11/chartex" xmlns:cx6="http://schemas.microsoft.com/office/drawing/2016/5/12/chartex" xmlns:cx7="http://schemas.microsoft.com/office/drawing/2016/5/13/chartex" xmlns:cx8="http://schemas.microsoft.com/office/drawing/2016/5/14/chartex" xmlns:mc="http://schemas.openxmlformats.org/markup-compatibility/2006" xmlns:aink="http://schemas.microsoft.com/office/drawing/2016/ink" xmlns:am3d="http://schemas.microsoft.com/office/drawing/2017/model3d" xmlns:o="urn:schemas-microsoft-com:office:office" xmlns:oel="http://schemas.microsoft.com/office/2019/extlst" xmlns:r="http://schemas.openxmlformats.org/officeDocument/2006/relationships" xmlns:m="http://schemas.openxmlformats.org/officeDocument/2006/math" xmlns:v="urn:schemas-microsoft-com:vml" xmlns:wp14="http://schemas.microsoft.com/office/word/2010/wordprocessingDrawing" xmlns:wp="http://schemas.openxmlformats.org/drawingml/2006/wordprocessingDrawing" xmlns:w10="urn:schemas-microsoft-com:office:word" xmlns:w="http://schemas.openxmlformats.org/wordprocessingml/2006/main" xmlns:w14="http://schemas.microsoft.com/office/word/2010/wordml" xmlns:w15="http://schemas.microsoft.com/office/word/2012/wordml" xmlns:w16cex="http://schemas.microsoft.com/office/word/2018/wordml/cex" xmlns:w16cid="http://schemas.microsoft.com/office/word/2016/wordml/cid" xmlns:w16="http://schemas.microsoft.com/office/word/2018/wordml" xmlns:w16du="http://schemas.microsoft.com/office/word/2023/wordml/word16du" xmlns:w16sdtdh="http://schemas.microsoft.com/office/word/2020/wordml/sdtdatahash" xmlns:w16sdtfl="http://schemas.microsoft.com/office/word/2024/wordml/sdtformatlock" xmlns:w16se="http://schemas.microsoft.com/office/word/2015/wordml/symex" xmlns:wpg="http://schemas.microsoft.com/office/word/2010/wordprocessingGroup" xmlns:wpi="http://schemas.microsoft.com/office/word/2010/wordprocessingInk" xmlns:wne="http://schemas.microsoft.com/office/word/2006/wordml" xmlns:wps="http://schemas.microsoft.com/office/word/2010/wordprocessingShape" mc:Ignorable="w14 w15 w16se w16cid w16 w16cex w16sdtdh w16sdtfl w16du wp14">
   <w:endnote w:type="separator" w:id="-1">
     <w:p>
       <w:pPr>
@@ -1455,7 +1368,7 @@
 </file>
 
 <file path=word/footnotes.xml><?xml version="1.0" encoding="utf-8"?>
-<w:footnotes xmlns:wpc="http://schemas.microsoft.com/office/word/2010/wordprocessingCanvas" xmlns:cx="http://schemas.microsoft.com/office/drawing/2014/chartex" xmlns:cx1="http://schemas.microsoft.com/office/drawing/2015/9/8/chartex" xmlns:cx2="http://schemas.microsoft.com/office/drawing/2015/10/21/chartex" xmlns:cx3="http://schemas.microsoft.com/office/drawing/2016/5/9/chartex" xmlns:cx4="http://schemas.microsoft.com/office/drawing/2016/5/10/chartex" xmlns:cx5="http://schemas.microsoft.com/office/drawing/2016/5/11/chartex" xmlns:cx6="http://schemas.microsoft.com/office/drawing/2016/5/12/chartex" xmlns:cx7="http://schemas.microsoft.com/office/drawing/2016/5/13/chartex" xmlns:cx8="http://schemas.microsoft.com/office/drawing/2016/5/14/chartex" xmlns:mc="http://schemas.openxmlformats.org/markup-compatibility/2006" xmlns:aink="http://schemas.microsoft.com/office/drawing/2016/ink" xmlns:am3d="http://schemas.microsoft.com/office/drawing/2017/model3d" xmlns:o="urn:schemas-microsoft-com:office:office" xmlns:oel="http://schemas.microsoft.com/office/2019/extlst" xmlns:r="http://schemas.openxmlformats.org/officeDocument/2006/relationships" xmlns:m="http://schemas.openxmlformats.org/officeDocument/2006/math" xmlns:v="urn:schemas-microsoft-com:vml" xmlns:wp14="http://schemas.microsoft.com/office/word/2010/wordprocessingDrawing" xmlns:wp="http://schemas.openxmlformats.org/drawingml/2006/wordprocessingDrawing" xmlns:w10="urn:schemas-microsoft-com:office:word" xmlns:w="http://schemas.openxmlformats.org/wordprocessingml/2006/main" xmlns:w14="http://schemas.microsoft.com/office/word/2010/wordml" xmlns:w15="http://schemas.microsoft.com/office/word/2012/wordml" xmlns:w16cei="http://schemas.microsoft.com/office/word/2026/wordml/cei" xmlns:w16cex="http://schemas.microsoft.com/office/word/2018/wordml/cex" xmlns:w16cid="http://schemas.microsoft.com/office/word/2016/wordml/cid" xmlns:w16="http://schemas.microsoft.com/office/word/2018/wordml" xmlns:w16du="http://schemas.microsoft.com/office/word/2023/wordml/word16du" xmlns:w16sdtdh="http://schemas.microsoft.com/office/word/2020/wordml/sdtdatahash" xmlns:w16sdtfl="http://schemas.microsoft.com/office/word/2024/wordml/sdtformatlock" xmlns:w16se="http://schemas.microsoft.com/office/word/2015/wordml/symex" xmlns:wpg="http://schemas.microsoft.com/office/word/2010/wordprocessingGroup" xmlns:wpi="http://schemas.microsoft.com/office/word/2010/wordprocessingInk" xmlns:wne="http://schemas.microsoft.com/office/word/2006/wordml" xmlns:wps="http://schemas.microsoft.com/office/word/2010/wordprocessingShape" mc:Ignorable="w14 w15 w16se w16cid w16 w16cex w16sdtdh w16sdtfl w16du wp14">
+<w:footnotes xmlns:wpc="http://schemas.microsoft.com/office/word/2010/wordprocessingCanvas" xmlns:cx="http://schemas.microsoft.com/office/drawing/2014/chartex" xmlns:cx1="http://schemas.microsoft.com/office/drawing/2015/9/8/chartex" xmlns:cx2="http://schemas.microsoft.com/office/drawing/2015/10/21/chartex" xmlns:cx3="http://schemas.microsoft.com/office/drawing/2016/5/9/chartex" xmlns:cx4="http://schemas.microsoft.com/office/drawing/2016/5/10/chartex" xmlns:cx5="http://schemas.microsoft.com/office/drawing/2016/5/11/chartex" xmlns:cx6="http://schemas.microsoft.com/office/drawing/2016/5/12/chartex" xmlns:cx7="http://schemas.microsoft.com/office/drawing/2016/5/13/chartex" xmlns:cx8="http://schemas.microsoft.com/office/drawing/2016/5/14/chartex" xmlns:mc="http://schemas.openxmlformats.org/markup-compatibility/2006" xmlns:aink="http://schemas.microsoft.com/office/drawing/2016/ink" xmlns:am3d="http://schemas.microsoft.com/office/drawing/2017/model3d" xmlns:o="urn:schemas-microsoft-com:office:office" xmlns:oel="http://schemas.microsoft.com/office/2019/extlst" xmlns:r="http://schemas.openxmlformats.org/officeDocument/2006/relationships" xmlns:m="http://schemas.openxmlformats.org/officeDocument/2006/math" xmlns:v="urn:schemas-microsoft-com:vml" xmlns:wp14="http://schemas.microsoft.com/office/word/2010/wordprocessingDrawing" xmlns:wp="http://schemas.openxmlformats.org/drawingml/2006/wordprocessingDrawing" xmlns:w10="urn:schemas-microsoft-com:office:word" xmlns:w="http://schemas.openxmlformats.org/wordprocessingml/2006/main" xmlns:w14="http://schemas.microsoft.com/office/word/2010/wordml" xmlns:w15="http://schemas.microsoft.com/office/word/2012/wordml" xmlns:w16cex="http://schemas.microsoft.com/office/word/2018/wordml/cex" xmlns:w16cid="http://schemas.microsoft.com/office/word/2016/wordml/cid" xmlns:w16="http://schemas.microsoft.com/office/word/2018/wordml" xmlns:w16du="http://schemas.microsoft.com/office/word/2023/wordml/word16du" xmlns:w16sdtdh="http://schemas.microsoft.com/office/word/2020/wordml/sdtdatahash" xmlns:w16sdtfl="http://schemas.microsoft.com/office/word/2024/wordml/sdtformatlock" xmlns:w16se="http://schemas.microsoft.com/office/word/2015/wordml/symex" xmlns:wpg="http://schemas.microsoft.com/office/word/2010/wordprocessingGroup" xmlns:wpi="http://schemas.microsoft.com/office/word/2010/wordprocessingInk" xmlns:wne="http://schemas.microsoft.com/office/word/2006/wordml" xmlns:wps="http://schemas.microsoft.com/office/word/2010/wordprocessingShape" mc:Ignorable="w14 w15 w16se w16cid w16 w16cex w16sdtdh w16sdtfl w16du wp14">
   <w:footnote w:type="separator" w:id="-1">
     <w:p>
       <w:pPr>
@@ -1480,7 +1393,7 @@
 </file>
 
 <file path=word/numbering.xml><?xml version="1.0" encoding="utf-8"?>
-<w:numbering xmlns:wpc="http://schemas.microsoft.com/office/word/2010/wordprocessingCanvas" xmlns:cx="http://schemas.microsoft.com/office/drawing/2014/chartex" xmlns:cx1="http://schemas.microsoft.com/office/drawing/2015/9/8/chartex" xmlns:cx2="http://schemas.microsoft.com/office/drawing/2015/10/21/chartex" xmlns:cx3="http://schemas.microsoft.com/office/drawing/2016/5/9/chartex" xmlns:cx4="http://schemas.microsoft.com/office/drawing/2016/5/10/chartex" xmlns:cx5="http://schemas.microsoft.com/office/drawing/2016/5/11/chartex" xmlns:cx6="http://schemas.microsoft.com/office/drawing/2016/5/12/chartex" xmlns:cx7="http://schemas.microsoft.com/office/drawing/2016/5/13/chartex" xmlns:cx8="http://schemas.microsoft.com/office/drawing/2016/5/14/chartex" xmlns:mc="http://schemas.openxmlformats.org/markup-compatibility/2006" xmlns:aink="http://schemas.microsoft.com/office/drawing/2016/ink" xmlns:am3d="http://schemas.microsoft.com/office/drawing/2017/model3d" xmlns:o="urn:schemas-microsoft-com:office:office" xmlns:oel="http://schemas.microsoft.com/office/2019/extlst" xmlns:r="http://schemas.openxmlformats.org/officeDocument/2006/relationships" xmlns:m="http://schemas.openxmlformats.org/officeDocument/2006/math" xmlns:v="urn:schemas-microsoft-com:vml" xmlns:wp14="http://schemas.microsoft.com/office/word/2010/wordprocessingDrawing" xmlns:wp="http://schemas.openxmlformats.org/drawingml/2006/wordprocessingDrawing" xmlns:w10="urn:schemas-microsoft-com:office:word" xmlns:w="http://schemas.openxmlformats.org/wordprocessingml/2006/main" xmlns:w14="http://schemas.microsoft.com/office/word/2010/wordml" xmlns:w15="http://schemas.microsoft.com/office/word/2012/wordml" xmlns:w16cei="http://schemas.microsoft.com/office/word/2026/wordml/cei" xmlns:w16cex="http://schemas.microsoft.com/office/word/2018/wordml/cex" xmlns:w16cid="http://schemas.microsoft.com/office/word/2016/wordml/cid" xmlns:w16="http://schemas.microsoft.com/office/word/2018/wordml" xmlns:w16du="http://schemas.microsoft.com/office/word/2023/wordml/word16du" xmlns:w16sdtdh="http://schemas.microsoft.com/office/word/2020/wordml/sdtdatahash" xmlns:w16sdtfl="http://schemas.microsoft.com/office/word/2024/wordml/sdtformatlock" xmlns:w16se="http://schemas.microsoft.com/office/word/2015/wordml/symex" xmlns:wpg="http://schemas.microsoft.com/office/word/2010/wordprocessingGroup" xmlns:wpi="http://schemas.microsoft.com/office/word/2010/wordprocessingInk" xmlns:wne="http://schemas.microsoft.com/office/word/2006/wordml" xmlns:wps="http://schemas.microsoft.com/office/word/2010/wordprocessingShape" mc:Ignorable="w14 w15 w16se w16cid w16 w16cex w16sdtdh w16sdtfl w16du wp14">
+<w:numbering xmlns:wpc="http://schemas.microsoft.com/office/word/2010/wordprocessingCanvas" xmlns:cx="http://schemas.microsoft.com/office/drawing/2014/chartex" xmlns:cx1="http://schemas.microsoft.com/office/drawing/2015/9/8/chartex" xmlns:cx2="http://schemas.microsoft.com/office/drawing/2015/10/21/chartex" xmlns:cx3="http://schemas.microsoft.com/office/drawing/2016/5/9/chartex" xmlns:cx4="http://schemas.microsoft.com/office/drawing/2016/5/10/chartex" xmlns:cx5="http://schemas.microsoft.com/office/drawing/2016/5/11/chartex" xmlns:cx6="http://schemas.microsoft.com/office/drawing/2016/5/12/chartex" xmlns:cx7="http://schemas.microsoft.com/office/drawing/2016/5/13/chartex" xmlns:cx8="http://schemas.microsoft.com/office/drawing/2016/5/14/chartex" xmlns:mc="http://schemas.openxmlformats.org/markup-compatibility/2006" xmlns:aink="http://schemas.microsoft.com/office/drawing/2016/ink" xmlns:am3d="http://schemas.microsoft.com/office/drawing/2017/model3d" xmlns:o="urn:schemas-microsoft-com:office:office" xmlns:oel="http://schemas.microsoft.com/office/2019/extlst" xmlns:r="http://schemas.openxmlformats.org/officeDocument/2006/relationships" xmlns:m="http://schemas.openxmlformats.org/officeDocument/2006/math" xmlns:v="urn:schemas-microsoft-com:vml" xmlns:wp14="http://schemas.microsoft.com/office/word/2010/wordprocessingDrawing" xmlns:wp="http://schemas.openxmlformats.org/drawingml/2006/wordprocessingDrawing" xmlns:w10="urn:schemas-microsoft-com:office:word" xmlns:w="http://schemas.openxmlformats.org/wordprocessingml/2006/main" xmlns:w14="http://schemas.microsoft.com/office/word/2010/wordml" xmlns:w15="http://schemas.microsoft.com/office/word/2012/wordml" xmlns:w16cex="http://schemas.microsoft.com/office/word/2018/wordml/cex" xmlns:w16cid="http://schemas.microsoft.com/office/word/2016/wordml/cid" xmlns:w16="http://schemas.microsoft.com/office/word/2018/wordml" xmlns:w16du="http://schemas.microsoft.com/office/word/2023/wordml/word16du" xmlns:w16sdtdh="http://schemas.microsoft.com/office/word/2020/wordml/sdtdatahash" xmlns:w16sdtfl="http://schemas.microsoft.com/office/word/2024/wordml/sdtformatlock" xmlns:w16se="http://schemas.microsoft.com/office/word/2015/wordml/symex" xmlns:wpg="http://schemas.microsoft.com/office/word/2010/wordprocessingGroup" xmlns:wpi="http://schemas.microsoft.com/office/word/2010/wordprocessingInk" xmlns:wne="http://schemas.microsoft.com/office/word/2006/wordml" xmlns:wps="http://schemas.microsoft.com/office/word/2010/wordprocessingShape" mc:Ignorable="w14 w15 w16se w16cid w16 w16cex w16sdtdh w16sdtfl w16du wp14">
   <w:abstractNum w:abstractNumId="0" w15:restartNumberingAfterBreak="0">
     <w:nsid w:val="4E2B089D"/>
     <w:multiLevelType w:val="hybridMultilevel"/>

</xml_diff>